<commit_message>
docs: link the ATMOSphere host-daemon deploy runbook + tooling from INTEGRATION §14 (HRD-157 discoverability)
Co-Authored-By: Claude Opus 4.8 <noreply@anthropic.com>
</commit_message>
<xml_diff>
--- a/docs/INTEGRATION.docx
+++ b/docs/INTEGRATION.docx
@@ -8110,6 +8110,118 @@
       </w:r>
       <w:r>
         <w:t xml:space="preserve">— one nano-detail, anti-bluff reference per flavor binary, documenting every subcommand the built binary surfaces, the env/credentials each needs, real example invocations, and live-vs-not-yet-implemented status. Cross-linked per-row in the §10 flavor table above.</w:t>
+      </w:r>
+    </w:p>
+    <w:p>
+      <w:pPr>
+        <w:pStyle w:val="Compact"/>
+        <w:numPr>
+          <w:ilvl w:val="0"/>
+          <w:numId w:val="1011"/>
+        </w:numPr>
+      </w:pPr>
+      <w:r>
+        <w:rPr>
+          <w:b/>
+          <w:bCs/>
+        </w:rPr>
+        <w:t xml:space="preserve">ATMOSphere host-daemon deploy</w:t>
+      </w:r>
+      <w:r>
+        <w:t xml:space="preserve">:</w:t>
+      </w:r>
+      <w:r>
+        <w:t xml:space="preserve"> </w:t>
+      </w:r>
+      <w:r>
+        <w:rPr>
+          <w:rStyle w:val="VerbatimChar"/>
+        </w:rPr>
+        <w:t xml:space="preserve">docs/guides/ATMOSPHERE_DAEMON_DEPLOY.md</w:t>
+      </w:r>
+      <w:r>
+        <w:t xml:space="preserve"> </w:t>
+      </w:r>
+      <w:r>
+        <w:t xml:space="preserve">+</w:t>
+      </w:r>
+      <w:r>
+        <w:t xml:space="preserve"> </w:t>
+      </w:r>
+      <w:r>
+        <w:rPr>
+          <w:rStyle w:val="VerbatimChar"/>
+        </w:rPr>
+        <w:t xml:space="preserve">deploy/atmosphere-herald/</w:t>
+      </w:r>
+      <w:r>
+        <w:t xml:space="preserve"> </w:t>
+      </w:r>
+      <w:r>
+        <w:t xml:space="preserve">— the operator runbook + systemd/launchd units +</w:t>
+      </w:r>
+      <w:r>
+        <w:t xml:space="preserve"> </w:t>
+      </w:r>
+      <w:r>
+        <w:rPr>
+          <w:rStyle w:val="VerbatimChar"/>
+        </w:rPr>
+        <w:t xml:space="preserve">install.sh</w:t>
+      </w:r>
+      <w:r>
+        <w:t xml:space="preserve">/</w:t>
+      </w:r>
+      <w:r>
+        <w:rPr>
+          <w:rStyle w:val="VerbatimChar"/>
+        </w:rPr>
+        <w:t xml:space="preserve">uninstall.sh</w:t>
+      </w:r>
+      <w:r>
+        <w:t xml:space="preserve">/</w:t>
+      </w:r>
+      <w:r>
+        <w:rPr>
+          <w:rStyle w:val="VerbatimChar"/>
+        </w:rPr>
+        <w:t xml:space="preserve">seed-subscribers.sh</w:t>
+      </w:r>
+      <w:r>
+        <w:t xml:space="preserve"> </w:t>
+      </w:r>
+      <w:r>
+        <w:t xml:space="preserve">for running the</w:t>
+      </w:r>
+      <w:r>
+        <w:t xml:space="preserve"> </w:t>
+      </w:r>
+      <w:r>
+        <w:rPr>
+          <w:rStyle w:val="VerbatimChar"/>
+        </w:rPr>
+        <w:t xml:space="preserve">pherald watch</w:t>
+      </w:r>
+      <w:r>
+        <w:t xml:space="preserve"> </w:t>
+      </w:r>
+      <w:r>
+        <w:t xml:space="preserve">(outbound SSoT→notify) and</w:t>
+      </w:r>
+      <w:r>
+        <w:t xml:space="preserve"> </w:t>
+      </w:r>
+      <w:r>
+        <w:rPr>
+          <w:rStyle w:val="VerbatimChar"/>
+        </w:rPr>
+        <w:t xml:space="preserve">pherald listen</w:t>
+      </w:r>
+      <w:r>
+        <w:t xml:space="preserve"> </w:t>
+      </w:r>
+      <w:r>
+        <w:t xml:space="preserve">(inbound→CRUD) daemons on the ATMOSphere host (HRD-157).</w:t>
       </w:r>
     </w:p>
     <w:p>

</xml_diff>